<commit_message>
doc: updated project report
</commit_message>
<xml_diff>
--- a/EchoWorld_Project_Report.docx
+++ b/EchoWorld_Project_Report.docx
@@ -14,6 +14,7 @@
         <w:rPr>
           <w:rFonts w:ascii="Times New Roman" w:hAnsi="Times New Roman" w:cs="Times New Roman"/>
           <w:b/>
+          <w:noProof/>
         </w:rPr>
         <w:drawing>
           <wp:inline distT="0" distB="0" distL="0" distR="0" wp14:anchorId="69B3CD0F" wp14:editId="360FC667">
@@ -242,15 +243,7 @@
           <w:b/>
           <w:bCs/>
         </w:rPr>
-        <w:t>MASTER OF SCIENC</w:t>
-      </w:r>
-      <w:r>
-        <w:rPr>
-          <w:rFonts w:ascii="Times New Roman" w:hAnsi="Times New Roman" w:cs="Times New Roman"/>
-          <w:b/>
-          <w:bCs/>
-        </w:rPr>
-        <w:t>E</w:t>
+        <w:t>MASTER OF SCIENCE</w:t>
       </w:r>
     </w:p>
     <w:p>
@@ -443,36 +436,17 @@
           <w:rFonts w:ascii="Times New Roman" w:hAnsi="Times New Roman" w:cs="Times New Roman"/>
           <w:b/>
         </w:rPr>
-        <w:t>(202</w:t>
-      </w:r>
-      <w:r>
-        <w:rPr>
-          <w:rFonts w:ascii="Times New Roman" w:hAnsi="Times New Roman" w:cs="Times New Roman"/>
-          <w:b/>
-        </w:rPr>
-        <w:t>6</w:t>
-      </w:r>
-      <w:r>
-        <w:rPr>
-          <w:rFonts w:ascii="Times New Roman" w:hAnsi="Times New Roman" w:cs="Times New Roman"/>
-          <w:b/>
-        </w:rPr>
-        <w:t>-202</w:t>
-      </w:r>
-      <w:r>
-        <w:rPr>
-          <w:rFonts w:ascii="Times New Roman" w:hAnsi="Times New Roman" w:cs="Times New Roman"/>
-          <w:b/>
-        </w:rPr>
-        <w:t>7</w:t>
-      </w:r>
-      <w:r>
-        <w:rPr>
-          <w:rFonts w:ascii="Times New Roman" w:hAnsi="Times New Roman" w:cs="Times New Roman"/>
-          <w:b/>
-        </w:rPr>
-        <w:t>)</w:t>
-      </w:r>
+        <w:t>(2026-2027)</w:t>
+      </w:r>
+    </w:p>
+    <w:p>
+      <w:pPr>
+        <w:jc w:val="center"/>
+        <w:rPr>
+          <w:rFonts w:ascii="Times New Roman" w:hAnsi="Times New Roman" w:cs="Times New Roman"/>
+          <w:b/>
+        </w:rPr>
+      </w:pPr>
     </w:p>
     <w:p>
       <w:pPr>
@@ -496,6 +470,7 @@
         <w:rPr>
           <w:rFonts w:ascii="Times New Roman" w:hAnsi="Times New Roman" w:cs="Times New Roman"/>
           <w:b/>
+          <w:noProof/>
         </w:rPr>
         <w:lastRenderedPageBreak/>
         <w:drawing>
@@ -2117,7 +2092,10 @@
           <w:u w:val="single"/>
         </w:rPr>
       </w:pPr>
-      <w:r>
+    </w:p>
+    <w:p>
+      <w:pPr>
+        <w:jc w:val="center"/>
         <w:rPr>
           <w:rFonts w:ascii="Times New Roman" w:hAnsi="Times New Roman" w:cs="Times New Roman"/>
           <w:b/>
@@ -2126,9 +2104,7 @@
           <w:szCs w:val="32"/>
           <w:u w:val="single"/>
         </w:rPr>
-        <w:lastRenderedPageBreak/>
-        <w:t>ACKNOWLEDGEMENT:</w:t>
-      </w:r>
+      </w:pPr>
       <w:r>
         <w:rPr>
           <w:rFonts w:ascii="Times New Roman" w:hAnsi="Times New Roman" w:cs="Times New Roman"/>
@@ -2138,6 +2114,18 @@
           <w:szCs w:val="32"/>
           <w:u w:val="single"/>
         </w:rPr>
+        <w:lastRenderedPageBreak/>
+        <w:t>ACKNOWLEDGEMENT:</w:t>
+      </w:r>
+      <w:r>
+        <w:rPr>
+          <w:rFonts w:ascii="Times New Roman" w:hAnsi="Times New Roman" w:cs="Times New Roman"/>
+          <w:b/>
+          <w:bCs/>
+          <w:sz w:val="32"/>
+          <w:szCs w:val="32"/>
+          <w:u w:val="single"/>
+        </w:rPr>
         <w:br/>
       </w:r>
     </w:p>
@@ -2897,7 +2885,7 @@
         </w:rPr>
         <w:sectPr>
           <w:footerReference w:type="default" r:id="rId8"/>
-          <w:pgSz w:w="12240" w:h="15840"/>
+          <w:pgSz w:w="11906" w:h="16838" w:code="9"/>
           <w:pgMar w:top="1500" w:right="820" w:bottom="280" w:left="1260" w:header="720" w:footer="720" w:gutter="0"/>
           <w:pgBorders w:offsetFrom="page">
             <w:top w:val="single" w:sz="4" w:space="24" w:color="000000"/>
@@ -7824,8 +7812,11 @@
     <w:p/>
     <w:p/>
     <w:p/>
-    <w:p/>
-    <w:p/>
+    <w:p>
+      <w:pPr>
+        <w:jc w:val="center"/>
+      </w:pPr>
+    </w:p>
     <w:p>
       <w:pPr>
         <w:jc w:val="center"/>
@@ -10937,6 +10928,7 @@
       <w:r>
         <w:rPr>
           <w:rFonts w:ascii="Times New Roman" w:hAnsi="Times New Roman" w:cs="Times New Roman"/>
+          <w:noProof/>
         </w:rPr>
         <w:drawing>
           <wp:inline distT="0" distB="0" distL="0" distR="0" wp14:anchorId="1B3D7B49" wp14:editId="1284E129">
@@ -11010,6 +11002,7 @@
           <w:rFonts w:ascii="Times New Roman" w:hAnsi="Times New Roman" w:cs="Times New Roman"/>
           <w:b/>
           <w:bCs/>
+          <w:noProof/>
         </w:rPr>
         <w:lastRenderedPageBreak/>
         <w:drawing>
@@ -11403,6 +11396,7 @@
       <w:r>
         <w:rPr>
           <w:rFonts w:ascii="Times New Roman" w:hAnsi="Times New Roman" w:cs="Times New Roman"/>
+          <w:noProof/>
         </w:rPr>
         <w:lastRenderedPageBreak/>
         <w:drawing>
@@ -16278,6 +16272,7 @@
       <w:r>
         <w:rPr>
           <w:rFonts w:ascii="Times New Roman" w:hAnsi="Times New Roman" w:cs="Times New Roman"/>
+          <w:noProof/>
         </w:rPr>
         <w:drawing>
           <wp:inline distT="0" distB="0" distL="0" distR="0" wp14:anchorId="605C00C7" wp14:editId="17AE59F7">
@@ -26697,6 +26692,7 @@
   <w:style w:type="character" w:default="1" w:styleId="DefaultParagraphFont">
     <w:name w:val="Default Paragraph Font"/>
     <w:uiPriority w:val="1"/>
+    <w:semiHidden/>
     <w:unhideWhenUsed/>
   </w:style>
   <w:style w:type="table" w:default="1" w:styleId="TableNormal">

</xml_diff>